<commit_message>
just removing some things from the text
</commit_message>
<xml_diff>
--- a/docs/paper/SILICON_paper.docx
+++ b/docs/paper/SILICON_paper.docx
@@ -6055,13 +6055,13 @@
         <w:t xml:space="preserve"> </w:t>
       </w:r>
       <w:r>
-        <w:t xml:space="preserve">and the position surface — the worst-scaled design in the</w:t>
-      </w:r>
-      <w:r>
-        <w:t xml:space="preserve"> </w:t>
-      </w:r>
-      <w:r>
-        <w:t xml:space="preserve">set, and the one reported as failing — returns the same 2.086% after rescaling</w:t>
+        <w:t xml:space="preserve">and the position surface, which is the worst-scaled design in</w:t>
+      </w:r>
+      <w:r>
+        <w:t xml:space="preserve"> </w:t>
+      </w:r>
+      <w:r>
+        <w:t xml:space="preserve">the set and the one reported as failing, returns the same 2.086% after rescaling</w:t>
       </w:r>
       <w:r>
         <w:t xml:space="preserve"> </w:t>

</xml_diff>